<commit_message>
update link to zenodo deposit
</commit_message>
<xml_diff>
--- a/article/article.docx
+++ b/article/article.docx
@@ -3803,7 +3803,7 @@
       </w:r>
     </w:p>
     <w:bookmarkEnd w:id="45"/>
-    <w:bookmarkStart w:id="48" w:name="open-research"/>
+    <w:bookmarkStart w:id="49" w:name="open-research"/>
     <w:p>
       <w:pPr>
         <w:pStyle w:val="Heading2"/>
@@ -3845,11 +3845,25 @@
         </w:r>
       </w:hyperlink>
       <w:r>
-        <w:t xml:space="preserve">. The derived data that support the findings of this study are also openly available in Zenodo at http://doi.org/, version 0.xx.</w:t>
-      </w:r>
-    </w:p>
-    <w:bookmarkEnd w:id="48"/>
-    <w:bookmarkStart w:id="144" w:name="references"/>
+        <w:t xml:space="preserve">. The derived data that support the findings of this study are also openly available in Zenodo at</w:t>
+      </w:r>
+      <w:r>
+        <w:t xml:space="preserve"> </w:t>
+      </w:r>
+      <w:hyperlink r:id="rId48">
+        <w:r>
+          <w:rPr>
+            <w:rStyle w:val="Hyperlink"/>
+          </w:rPr>
+          <w:t xml:space="preserve">https://zenodo.org/records/19840311</w:t>
+        </w:r>
+      </w:hyperlink>
+      <w:r>
+        <w:t xml:space="preserve">, version 0.9.</w:t>
+      </w:r>
+    </w:p>
+    <w:bookmarkEnd w:id="49"/>
+    <w:bookmarkStart w:id="145" w:name="references"/>
     <w:p>
       <w:pPr>
         <w:pStyle w:val="Heading2"/>
@@ -3858,8 +3872,8 @@
         <w:t xml:space="preserve">References</w:t>
       </w:r>
     </w:p>
-    <w:bookmarkStart w:id="143" w:name="refs"/>
-    <w:bookmarkStart w:id="50" w:name="ref-quarto"/>
+    <w:bookmarkStart w:id="144" w:name="refs"/>
+    <w:bookmarkStart w:id="51" w:name="ref-quarto"/>
     <w:p>
       <w:pPr>
         <w:pStyle w:val="Bibliography"/>
@@ -3882,7 +3896,7 @@
       <w:r>
         <w:t xml:space="preserve"> </w:t>
       </w:r>
-      <w:hyperlink r:id="rId49">
+      <w:hyperlink r:id="rId50">
         <w:r>
           <w:rPr>
             <w:rStyle w:val="Hyperlink"/>
@@ -3894,8 +3908,8 @@
         <w:t xml:space="preserve">.</w:t>
       </w:r>
     </w:p>
-    <w:bookmarkEnd w:id="50"/>
-    <w:bookmarkStart w:id="51" w:name="ref-data.table"/>
+    <w:bookmarkEnd w:id="51"/>
+    <w:bookmarkStart w:id="52" w:name="ref-data.table"/>
     <w:p>
       <w:pPr>
         <w:pStyle w:val="Bibliography"/>
@@ -3910,8 +3924,8 @@
         <w:t xml:space="preserve">“Data.table: Extension of ‘Data.frame‘.”</w:t>
       </w:r>
     </w:p>
-    <w:bookmarkEnd w:id="51"/>
-    <w:bookmarkStart w:id="53" w:name="ref-Bentsen2019"/>
+    <w:bookmarkEnd w:id="52"/>
+    <w:bookmarkStart w:id="54" w:name="ref-Bentsen2019"/>
     <w:p>
       <w:pPr>
         <w:pStyle w:val="Bibliography"/>
@@ -3961,7 +3975,7 @@
       <w:r>
         <w:t xml:space="preserve"> </w:t>
       </w:r>
-      <w:hyperlink r:id="rId52">
+      <w:hyperlink r:id="rId53">
         <w:r>
           <w:rPr>
             <w:rStyle w:val="Hyperlink"/>
@@ -3973,8 +3987,8 @@
         <w:t xml:space="preserve">.</w:t>
       </w:r>
     </w:p>
-    <w:bookmarkEnd w:id="53"/>
-    <w:bookmarkStart w:id="55" w:name="ref-Bentsen2019a"/>
+    <w:bookmarkEnd w:id="54"/>
+    <w:bookmarkStart w:id="56" w:name="ref-Bentsen2019a"/>
     <w:p>
       <w:pPr>
         <w:pStyle w:val="Bibliography"/>
@@ -4024,7 +4038,7 @@
       <w:r>
         <w:t xml:space="preserve"> </w:t>
       </w:r>
-      <w:hyperlink r:id="rId54">
+      <w:hyperlink r:id="rId55">
         <w:r>
           <w:rPr>
             <w:rStyle w:val="Hyperlink"/>
@@ -4036,8 +4050,8 @@
         <w:t xml:space="preserve">.</w:t>
       </w:r>
     </w:p>
-    <w:bookmarkEnd w:id="55"/>
-    <w:bookmarkStart w:id="57" w:name="ref-Berry2011"/>
+    <w:bookmarkEnd w:id="56"/>
+    <w:bookmarkStart w:id="58" w:name="ref-Berry2011"/>
     <w:p>
       <w:pPr>
         <w:pStyle w:val="Bibliography"/>
@@ -4070,7 +4084,7 @@
       <w:r>
         <w:t xml:space="preserve"> </w:t>
       </w:r>
-      <w:hyperlink r:id="rId56">
+      <w:hyperlink r:id="rId57">
         <w:r>
           <w:rPr>
             <w:rStyle w:val="Hyperlink"/>
@@ -4082,8 +4096,8 @@
         <w:t xml:space="preserve">.</w:t>
       </w:r>
     </w:p>
-    <w:bookmarkEnd w:id="57"/>
-    <w:bookmarkStart w:id="59" w:name="ref-Cai2022"/>
+    <w:bookmarkEnd w:id="58"/>
+    <w:bookmarkStart w:id="60" w:name="ref-Cai2022"/>
     <w:p>
       <w:pPr>
         <w:pStyle w:val="Bibliography"/>
@@ -4137,7 +4151,7 @@
       <w:r>
         <w:t xml:space="preserve"> </w:t>
       </w:r>
-      <w:hyperlink r:id="rId58">
+      <w:hyperlink r:id="rId59">
         <w:r>
           <w:rPr>
             <w:rStyle w:val="Hyperlink"/>
@@ -4149,8 +4163,8 @@
         <w:t xml:space="preserve">.</w:t>
       </w:r>
     </w:p>
-    <w:bookmarkEnd w:id="59"/>
-    <w:bookmarkStart w:id="61" w:name="ref-metR"/>
+    <w:bookmarkEnd w:id="60"/>
+    <w:bookmarkStart w:id="62" w:name="ref-metR"/>
     <w:p>
       <w:pPr>
         <w:pStyle w:val="Bibliography"/>
@@ -4167,7 +4181,7 @@
       <w:r>
         <w:t xml:space="preserve"> </w:t>
       </w:r>
-      <w:hyperlink r:id="rId60">
+      <w:hyperlink r:id="rId61">
         <w:r>
           <w:rPr>
             <w:rStyle w:val="Hyperlink"/>
@@ -4179,8 +4193,8 @@
         <w:t xml:space="preserve">.</w:t>
       </w:r>
     </w:p>
-    <w:bookmarkEnd w:id="61"/>
-    <w:bookmarkStart w:id="63" w:name="ref-rcdo"/>
+    <w:bookmarkEnd w:id="62"/>
+    <w:bookmarkStart w:id="64" w:name="ref-rcdo"/>
     <w:p>
       <w:pPr>
         <w:pStyle w:val="Bibliography"/>
@@ -4197,7 +4211,7 @@
       <w:r>
         <w:t xml:space="preserve"> </w:t>
       </w:r>
-      <w:hyperlink r:id="rId62">
+      <w:hyperlink r:id="rId63">
         <w:r>
           <w:rPr>
             <w:rStyle w:val="Hyperlink"/>
@@ -4209,8 +4223,8 @@
         <w:t xml:space="preserve">.</w:t>
       </w:r>
     </w:p>
-    <w:bookmarkEnd w:id="63"/>
-    <w:bookmarkStart w:id="65" w:name="ref-Catto2014"/>
+    <w:bookmarkEnd w:id="64"/>
+    <w:bookmarkStart w:id="66" w:name="ref-Catto2014"/>
     <w:p>
       <w:pPr>
         <w:pStyle w:val="Bibliography"/>
@@ -4243,7 +4257,7 @@
       <w:r>
         <w:t xml:space="preserve"> </w:t>
       </w:r>
-      <w:hyperlink r:id="rId64">
+      <w:hyperlink r:id="rId65">
         <w:r>
           <w:rPr>
             <w:rStyle w:val="Hyperlink"/>
@@ -4255,8 +4269,8 @@
         <w:t xml:space="preserve">.</w:t>
       </w:r>
     </w:p>
-    <w:bookmarkEnd w:id="65"/>
-    <w:bookmarkStart w:id="67" w:name="ref-Catto2013"/>
+    <w:bookmarkEnd w:id="66"/>
+    <w:bookmarkStart w:id="68" w:name="ref-Catto2013"/>
     <w:p>
       <w:pPr>
         <w:pStyle w:val="Bibliography"/>
@@ -4289,7 +4303,7 @@
       <w:r>
         <w:t xml:space="preserve"> </w:t>
       </w:r>
-      <w:hyperlink r:id="rId66">
+      <w:hyperlink r:id="rId67">
         <w:r>
           <w:rPr>
             <w:rStyle w:val="Hyperlink"/>
@@ -4301,8 +4315,8 @@
         <w:t xml:space="preserve">.</w:t>
       </w:r>
     </w:p>
-    <w:bookmarkEnd w:id="67"/>
-    <w:bookmarkStart w:id="69" w:name="ref-Chemke2022"/>
+    <w:bookmarkEnd w:id="68"/>
+    <w:bookmarkStart w:id="70" w:name="ref-Chemke2022"/>
     <w:p>
       <w:pPr>
         <w:pStyle w:val="Bibliography"/>
@@ -4347,7 +4361,7 @@
       <w:r>
         <w:t xml:space="preserve"> </w:t>
       </w:r>
-      <w:hyperlink r:id="rId68">
+      <w:hyperlink r:id="rId69">
         <w:r>
           <w:rPr>
             <w:rStyle w:val="Hyperlink"/>
@@ -4359,8 +4373,8 @@
         <w:t xml:space="preserve">.</w:t>
       </w:r>
     </w:p>
-    <w:bookmarkEnd w:id="69"/>
-    <w:bookmarkStart w:id="71" w:name="ref-ConsortiumEC-Earth2019"/>
+    <w:bookmarkEnd w:id="70"/>
+    <w:bookmarkStart w:id="72" w:name="ref-ConsortiumEC-Earth2019"/>
     <w:p>
       <w:pPr>
         <w:pStyle w:val="Bibliography"/>
@@ -4410,7 +4424,7 @@
       <w:r>
         <w:t xml:space="preserve"> </w:t>
       </w:r>
-      <w:hyperlink r:id="rId70">
+      <w:hyperlink r:id="rId71">
         <w:r>
           <w:rPr>
             <w:rStyle w:val="Hyperlink"/>
@@ -4422,8 +4436,8 @@
         <w:t xml:space="preserve">.</w:t>
       </w:r>
     </w:p>
-    <w:bookmarkEnd w:id="71"/>
-    <w:bookmarkStart w:id="73" w:name="ref-ConsortiumEC-Earth2019b"/>
+    <w:bookmarkEnd w:id="72"/>
+    <w:bookmarkStart w:id="74" w:name="ref-ConsortiumEC-Earth2019b"/>
     <w:p>
       <w:pPr>
         <w:pStyle w:val="Bibliography"/>
@@ -4473,7 +4487,7 @@
       <w:r>
         <w:t xml:space="preserve"> </w:t>
       </w:r>
-      <w:hyperlink r:id="rId72">
+      <w:hyperlink r:id="rId73">
         <w:r>
           <w:rPr>
             <w:rStyle w:val="Hyperlink"/>
@@ -4485,8 +4499,8 @@
         <w:t xml:space="preserve">.</w:t>
       </w:r>
     </w:p>
-    <w:bookmarkEnd w:id="73"/>
-    <w:bookmarkStart w:id="75" w:name="ref-ConsortiumEC-Earth2019a"/>
+    <w:bookmarkEnd w:id="74"/>
+    <w:bookmarkStart w:id="76" w:name="ref-ConsortiumEC-Earth2019a"/>
     <w:p>
       <w:pPr>
         <w:pStyle w:val="Bibliography"/>
@@ -4536,7 +4550,7 @@
       <w:r>
         <w:t xml:space="preserve"> </w:t>
       </w:r>
-      <w:hyperlink r:id="rId74">
+      <w:hyperlink r:id="rId75">
         <w:r>
           <w:rPr>
             <w:rStyle w:val="Hyperlink"/>
@@ -4548,8 +4562,8 @@
         <w:t xml:space="preserve">.</w:t>
       </w:r>
     </w:p>
-    <w:bookmarkEnd w:id="75"/>
-    <w:bookmarkStart w:id="77" w:name="ref-ConsortiumEC-Earth2019c"/>
+    <w:bookmarkEnd w:id="76"/>
+    <w:bookmarkStart w:id="78" w:name="ref-ConsortiumEC-Earth2019c"/>
     <w:p>
       <w:pPr>
         <w:pStyle w:val="Bibliography"/>
@@ -4599,7 +4613,7 @@
       <w:r>
         <w:t xml:space="preserve"> </w:t>
       </w:r>
-      <w:hyperlink r:id="rId76">
+      <w:hyperlink r:id="rId77">
         <w:r>
           <w:rPr>
             <w:rStyle w:val="Hyperlink"/>
@@ -4611,8 +4625,8 @@
         <w:t xml:space="preserve">.</w:t>
       </w:r>
     </w:p>
-    <w:bookmarkEnd w:id="77"/>
-    <w:bookmarkStart w:id="79" w:name="ref-ConsortiumEC-Earth2020a"/>
+    <w:bookmarkEnd w:id="78"/>
+    <w:bookmarkStart w:id="80" w:name="ref-ConsortiumEC-Earth2020a"/>
     <w:p>
       <w:pPr>
         <w:pStyle w:val="Bibliography"/>
@@ -4662,7 +4676,7 @@
       <w:r>
         <w:t xml:space="preserve"> </w:t>
       </w:r>
-      <w:hyperlink r:id="rId78">
+      <w:hyperlink r:id="rId79">
         <w:r>
           <w:rPr>
             <w:rStyle w:val="Hyperlink"/>
@@ -4674,8 +4688,8 @@
         <w:t xml:space="preserve">.</w:t>
       </w:r>
     </w:p>
-    <w:bookmarkEnd w:id="79"/>
-    <w:bookmarkStart w:id="81" w:name="ref-ConsortiumEC-Earth2020"/>
+    <w:bookmarkEnd w:id="80"/>
+    <w:bookmarkStart w:id="82" w:name="ref-ConsortiumEC-Earth2020"/>
     <w:p>
       <w:pPr>
         <w:pStyle w:val="Bibliography"/>
@@ -4725,7 +4739,7 @@
       <w:r>
         <w:t xml:space="preserve"> </w:t>
       </w:r>
-      <w:hyperlink r:id="rId80">
+      <w:hyperlink r:id="rId81">
         <w:r>
           <w:rPr>
             <w:rStyle w:val="Hyperlink"/>
@@ -4737,8 +4751,8 @@
         <w:t xml:space="preserve">.</w:t>
       </w:r>
     </w:p>
-    <w:bookmarkEnd w:id="81"/>
-    <w:bookmarkStart w:id="83" w:name="ref-ConsortiumEC-Earth2021"/>
+    <w:bookmarkEnd w:id="82"/>
+    <w:bookmarkStart w:id="84" w:name="ref-ConsortiumEC-Earth2021"/>
     <w:p>
       <w:pPr>
         <w:pStyle w:val="Bibliography"/>
@@ -4788,7 +4802,7 @@
       <w:r>
         <w:t xml:space="preserve"> </w:t>
       </w:r>
-      <w:hyperlink r:id="rId82">
+      <w:hyperlink r:id="rId83">
         <w:r>
           <w:rPr>
             <w:rStyle w:val="Hyperlink"/>
@@ -4800,8 +4814,8 @@
         <w:t xml:space="preserve">.</w:t>
       </w:r>
     </w:p>
-    <w:bookmarkEnd w:id="83"/>
-    <w:bookmarkStart w:id="85" w:name="ref-ConsortiumEC-Earth2023"/>
+    <w:bookmarkEnd w:id="84"/>
+    <w:bookmarkStart w:id="86" w:name="ref-ConsortiumEC-Earth2023"/>
     <w:p>
       <w:pPr>
         <w:pStyle w:val="Bibliography"/>
@@ -4851,7 +4865,7 @@
       <w:r>
         <w:t xml:space="preserve"> </w:t>
       </w:r>
-      <w:hyperlink r:id="rId84">
+      <w:hyperlink r:id="rId85">
         <w:r>
           <w:rPr>
             <w:rStyle w:val="Hyperlink"/>
@@ -4863,8 +4877,8 @@
         <w:t xml:space="preserve">.</w:t>
       </w:r>
     </w:p>
-    <w:bookmarkEnd w:id="85"/>
-    <w:bookmarkStart w:id="87" w:name="ref-Eyring2016"/>
+    <w:bookmarkEnd w:id="86"/>
+    <w:bookmarkStart w:id="88" w:name="ref-Eyring2016"/>
     <w:p>
       <w:pPr>
         <w:pStyle w:val="Bibliography"/>
@@ -4915,7 +4929,7 @@
       <w:r>
         <w:t xml:space="preserve"> </w:t>
       </w:r>
-      <w:hyperlink r:id="rId86">
+      <w:hyperlink r:id="rId87">
         <w:r>
           <w:rPr>
             <w:rStyle w:val="Hyperlink"/>
@@ -4927,8 +4941,8 @@
         <w:t xml:space="preserve">.</w:t>
       </w:r>
     </w:p>
-    <w:bookmarkEnd w:id="87"/>
-    <w:bookmarkStart w:id="89" w:name="ref-Guo2018a"/>
+    <w:bookmarkEnd w:id="88"/>
+    <w:bookmarkStart w:id="90" w:name="ref-Guo2018a"/>
     <w:p>
       <w:pPr>
         <w:pStyle w:val="Bibliography"/>
@@ -4978,7 +4992,7 @@
       <w:r>
         <w:t xml:space="preserve"> </w:t>
       </w:r>
-      <w:hyperlink r:id="rId88">
+      <w:hyperlink r:id="rId89">
         <w:r>
           <w:rPr>
             <w:rStyle w:val="Hyperlink"/>
@@ -4990,8 +5004,8 @@
         <w:t xml:space="preserve">.</w:t>
       </w:r>
     </w:p>
-    <w:bookmarkEnd w:id="89"/>
-    <w:bookmarkStart w:id="91" w:name="ref-Guo2018"/>
+    <w:bookmarkEnd w:id="90"/>
+    <w:bookmarkStart w:id="92" w:name="ref-Guo2018"/>
     <w:p>
       <w:pPr>
         <w:pStyle w:val="Bibliography"/>
@@ -5032,7 +5046,7 @@
       <w:r>
         <w:t xml:space="preserve"> </w:t>
       </w:r>
-      <w:hyperlink r:id="rId90">
+      <w:hyperlink r:id="rId91">
         <w:r>
           <w:rPr>
             <w:rStyle w:val="Hyperlink"/>
@@ -5044,8 +5058,8 @@
         <w:t xml:space="preserve">.</w:t>
       </w:r>
     </w:p>
-    <w:bookmarkEnd w:id="91"/>
-    <w:bookmarkStart w:id="93" w:name="ref-Harvey2014"/>
+    <w:bookmarkEnd w:id="92"/>
+    <w:bookmarkStart w:id="94" w:name="ref-Harvey2014"/>
     <w:p>
       <w:pPr>
         <w:pStyle w:val="Bibliography"/>
@@ -5090,7 +5104,7 @@
       <w:r>
         <w:t xml:space="preserve"> </w:t>
       </w:r>
-      <w:hyperlink r:id="rId92">
+      <w:hyperlink r:id="rId93">
         <w:r>
           <w:rPr>
             <w:rStyle w:val="Hyperlink"/>
@@ -5102,8 +5116,8 @@
         <w:t xml:space="preserve">.</w:t>
       </w:r>
     </w:p>
-    <w:bookmarkEnd w:id="93"/>
-    <w:bookmarkStart w:id="95" w:name="ref-Jungclaus2019"/>
+    <w:bookmarkEnd w:id="94"/>
+    <w:bookmarkStart w:id="96" w:name="ref-Jungclaus2019"/>
     <w:p>
       <w:pPr>
         <w:pStyle w:val="Bibliography"/>
@@ -5159,7 +5173,7 @@
       <w:r>
         <w:t xml:space="preserve"> </w:t>
       </w:r>
-      <w:hyperlink r:id="rId94">
+      <w:hyperlink r:id="rId95">
         <w:r>
           <w:rPr>
             <w:rStyle w:val="Hyperlink"/>
@@ -5171,8 +5185,8 @@
         <w:t xml:space="preserve">.</w:t>
       </w:r>
     </w:p>
-    <w:bookmarkEnd w:id="95"/>
-    <w:bookmarkStart w:id="97" w:name="ref-King2024"/>
+    <w:bookmarkEnd w:id="96"/>
+    <w:bookmarkStart w:id="98" w:name="ref-King2024"/>
     <w:p>
       <w:pPr>
         <w:pStyle w:val="Bibliography"/>
@@ -5217,7 +5231,7 @@
       <w:r>
         <w:t xml:space="preserve"> </w:t>
       </w:r>
-      <w:hyperlink r:id="rId96">
+      <w:hyperlink r:id="rId97">
         <w:r>
           <w:rPr>
             <w:rStyle w:val="Hyperlink"/>
@@ -5229,8 +5243,8 @@
         <w:t xml:space="preserve">.</w:t>
       </w:r>
     </w:p>
-    <w:bookmarkEnd w:id="97"/>
-    <w:bookmarkStart w:id="99" w:name="ref-Konstali2024"/>
+    <w:bookmarkEnd w:id="98"/>
+    <w:bookmarkStart w:id="100" w:name="ref-Konstali2024"/>
     <w:p>
       <w:pPr>
         <w:pStyle w:val="Bibliography"/>
@@ -5296,7 +5310,7 @@
       <w:r>
         <w:t xml:space="preserve"> </w:t>
       </w:r>
-      <w:hyperlink r:id="rId98">
+      <w:hyperlink r:id="rId99">
         <w:r>
           <w:rPr>
             <w:rStyle w:val="Hyperlink"/>
@@ -5308,8 +5322,8 @@
         <w:t xml:space="preserve">.</w:t>
       </w:r>
     </w:p>
-    <w:bookmarkEnd w:id="99"/>
-    <w:bookmarkStart w:id="101" w:name="ref-ggside"/>
+    <w:bookmarkEnd w:id="100"/>
+    <w:bookmarkStart w:id="102" w:name="ref-ggside"/>
     <w:p>
       <w:pPr>
         <w:pStyle w:val="Bibliography"/>
@@ -5326,7 +5340,7 @@
       <w:r>
         <w:t xml:space="preserve"> </w:t>
       </w:r>
-      <w:hyperlink r:id="rId100">
+      <w:hyperlink r:id="rId101">
         <w:r>
           <w:rPr>
             <w:rStyle w:val="Hyperlink"/>
@@ -5338,8 +5352,8 @@
         <w:t xml:space="preserve">.</w:t>
       </w:r>
     </w:p>
-    <w:bookmarkEnd w:id="101"/>
-    <w:bookmarkStart w:id="103" w:name="ref-Lovato2021"/>
+    <w:bookmarkEnd w:id="102"/>
+    <w:bookmarkStart w:id="104" w:name="ref-Lovato2021"/>
     <w:p>
       <w:pPr>
         <w:pStyle w:val="Bibliography"/>
@@ -5389,7 +5403,7 @@
       <w:r>
         <w:t xml:space="preserve"> </w:t>
       </w:r>
-      <w:hyperlink r:id="rId102">
+      <w:hyperlink r:id="rId103">
         <w:r>
           <w:rPr>
             <w:rStyle w:val="Hyperlink"/>
@@ -5401,8 +5415,8 @@
         <w:t xml:space="preserve">.</w:t>
       </w:r>
     </w:p>
-    <w:bookmarkEnd w:id="103"/>
-    <w:bookmarkStart w:id="105" w:name="ref-Lovato2021a"/>
+    <w:bookmarkEnd w:id="104"/>
+    <w:bookmarkStart w:id="106" w:name="ref-Lovato2021a"/>
     <w:p>
       <w:pPr>
         <w:pStyle w:val="Bibliography"/>
@@ -5452,7 +5466,7 @@
       <w:r>
         <w:t xml:space="preserve"> </w:t>
       </w:r>
-      <w:hyperlink r:id="rId104">
+      <w:hyperlink r:id="rId105">
         <w:r>
           <w:rPr>
             <w:rStyle w:val="Hyperlink"/>
@@ -5464,8 +5478,8 @@
         <w:t xml:space="preserve">.</w:t>
       </w:r>
     </w:p>
-    <w:bookmarkEnd w:id="105"/>
-    <w:bookmarkStart w:id="107" w:name="ref-Muir2010"/>
+    <w:bookmarkEnd w:id="106"/>
+    <w:bookmarkStart w:id="108" w:name="ref-Muir2010"/>
     <w:p>
       <w:pPr>
         <w:pStyle w:val="Bibliography"/>
@@ -5498,7 +5512,7 @@
       <w:r>
         <w:t xml:space="preserve"> </w:t>
       </w:r>
-      <w:hyperlink r:id="rId106">
+      <w:hyperlink r:id="rId107">
         <w:r>
           <w:rPr>
             <w:rStyle w:val="Hyperlink"/>
@@ -5510,8 +5524,8 @@
         <w:t xml:space="preserve">.</w:t>
       </w:r>
     </w:p>
-    <w:bookmarkEnd w:id="107"/>
-    <w:bookmarkStart w:id="109" w:name="ref-OGorman2010"/>
+    <w:bookmarkEnd w:id="108"/>
+    <w:bookmarkStart w:id="110" w:name="ref-OGorman2010"/>
     <w:p>
       <w:pPr>
         <w:pStyle w:val="Bibliography"/>
@@ -5544,7 +5558,7 @@
       <w:r>
         <w:t xml:space="preserve"> </w:t>
       </w:r>
-      <w:hyperlink r:id="rId108">
+      <w:hyperlink r:id="rId109">
         <w:r>
           <w:rPr>
             <w:rStyle w:val="Hyperlink"/>
@@ -5556,8 +5570,8 @@
         <w:t xml:space="preserve">.</w:t>
       </w:r>
     </w:p>
-    <w:bookmarkEnd w:id="109"/>
-    <w:bookmarkStart w:id="111" w:name="ref-ONeill2016"/>
+    <w:bookmarkEnd w:id="110"/>
+    <w:bookmarkStart w:id="112" w:name="ref-ONeill2016"/>
     <w:p>
       <w:pPr>
         <w:pStyle w:val="Bibliography"/>
@@ -5617,7 +5631,7 @@
       <w:r>
         <w:t xml:space="preserve"> </w:t>
       </w:r>
-      <w:hyperlink r:id="rId110">
+      <w:hyperlink r:id="rId111">
         <w:r>
           <w:rPr>
             <w:rStyle w:val="Hyperlink"/>
@@ -5629,8 +5643,8 @@
         <w:t xml:space="preserve">.</w:t>
       </w:r>
     </w:p>
-    <w:bookmarkEnd w:id="111"/>
-    <w:bookmarkStart w:id="113" w:name="ref-Parfitt2017"/>
+    <w:bookmarkEnd w:id="112"/>
+    <w:bookmarkStart w:id="114" w:name="ref-Parfitt2017"/>
     <w:p>
       <w:pPr>
         <w:pStyle w:val="Bibliography"/>
@@ -5699,7 +5713,7 @@
       <w:r>
         <w:t xml:space="preserve"> </w:t>
       </w:r>
-      <w:hyperlink r:id="rId112">
+      <w:hyperlink r:id="rId113">
         <w:r>
           <w:rPr>
             <w:rStyle w:val="Hyperlink"/>
@@ -5711,8 +5725,8 @@
         <w:t xml:space="preserve">.</w:t>
       </w:r>
     </w:p>
-    <w:bookmarkEnd w:id="113"/>
-    <w:bookmarkStart w:id="114" w:name="ref-patchwork"/>
+    <w:bookmarkEnd w:id="114"/>
+    <w:bookmarkStart w:id="115" w:name="ref-patchwork"/>
     <w:p>
       <w:pPr>
         <w:pStyle w:val="Bibliography"/>
@@ -5727,8 +5741,8 @@
         <w:t xml:space="preserve">“Patchwork: The Composer of Plots.”</w:t>
       </w:r>
     </w:p>
-    <w:bookmarkEnd w:id="114"/>
-    <w:bookmarkStart w:id="116" w:name="ref-R"/>
+    <w:bookmarkEnd w:id="115"/>
+    <w:bookmarkStart w:id="117" w:name="ref-R"/>
     <w:p>
       <w:pPr>
         <w:pStyle w:val="Bibliography"/>
@@ -5751,7 +5765,7 @@
       <w:r>
         <w:t xml:space="preserve"> </w:t>
       </w:r>
-      <w:hyperlink r:id="rId115">
+      <w:hyperlink r:id="rId116">
         <w:r>
           <w:rPr>
             <w:rStyle w:val="Hyperlink"/>
@@ -5763,8 +5777,8 @@
         <w:t xml:space="preserve">.</w:t>
       </w:r>
     </w:p>
-    <w:bookmarkEnd w:id="116"/>
-    <w:bookmarkStart w:id="118" w:name="ref-Reeder2015"/>
+    <w:bookmarkEnd w:id="117"/>
+    <w:bookmarkStart w:id="119" w:name="ref-Reeder2015"/>
     <w:p>
       <w:pPr>
         <w:pStyle w:val="Bibliography"/>
@@ -5806,7 +5820,7 @@
       <w:r>
         <w:t xml:space="preserve"> </w:t>
       </w:r>
-      <w:hyperlink r:id="rId117">
+      <w:hyperlink r:id="rId118">
         <w:r>
           <w:rPr>
             <w:rStyle w:val="Hyperlink"/>
@@ -5818,8 +5832,8 @@
         <w:t xml:space="preserve">.</w:t>
       </w:r>
     </w:p>
-    <w:bookmarkEnd w:id="118"/>
-    <w:bookmarkStart w:id="120" w:name="ref-Reeder2021"/>
+    <w:bookmarkEnd w:id="119"/>
+    <w:bookmarkStart w:id="121" w:name="ref-Reeder2021"/>
     <w:p>
       <w:pPr>
         <w:pStyle w:val="Bibliography"/>
@@ -5885,7 +5899,7 @@
       <w:r>
         <w:t xml:space="preserve"> </w:t>
       </w:r>
-      <w:hyperlink r:id="rId119">
+      <w:hyperlink r:id="rId120">
         <w:r>
           <w:rPr>
             <w:rStyle w:val="Hyperlink"/>
@@ -5897,8 +5911,8 @@
         <w:t xml:space="preserve">.</w:t>
       </w:r>
     </w:p>
-    <w:bookmarkEnd w:id="120"/>
-    <w:bookmarkStart w:id="122" w:name="ref-Schneider2015"/>
+    <w:bookmarkEnd w:id="121"/>
+    <w:bookmarkStart w:id="123" w:name="ref-Schneider2015"/>
     <w:p>
       <w:pPr>
         <w:pStyle w:val="Bibliography"/>
@@ -5952,7 +5966,7 @@
       <w:r>
         <w:t xml:space="preserve"> </w:t>
       </w:r>
-      <w:hyperlink r:id="rId121">
+      <w:hyperlink r:id="rId122">
         <w:r>
           <w:rPr>
             <w:rStyle w:val="Hyperlink"/>
@@ -5964,8 +5978,8 @@
         <w:t xml:space="preserve">.</w:t>
       </w:r>
     </w:p>
-    <w:bookmarkEnd w:id="122"/>
-    <w:bookmarkStart w:id="124" w:name="ref-Schupfner2019"/>
+    <w:bookmarkEnd w:id="123"/>
+    <w:bookmarkStart w:id="125" w:name="ref-Schupfner2019"/>
     <w:p>
       <w:pPr>
         <w:pStyle w:val="Bibliography"/>
@@ -6021,7 +6035,7 @@
       <w:r>
         <w:t xml:space="preserve"> </w:t>
       </w:r>
-      <w:hyperlink r:id="rId123">
+      <w:hyperlink r:id="rId124">
         <w:r>
           <w:rPr>
             <w:rStyle w:val="Hyperlink"/>
@@ -6033,8 +6047,8 @@
         <w:t xml:space="preserve">.</w:t>
       </w:r>
     </w:p>
-    <w:bookmarkEnd w:id="124"/>
-    <w:bookmarkStart w:id="126" w:name="ref-Simmonds2012"/>
+    <w:bookmarkEnd w:id="125"/>
+    <w:bookmarkStart w:id="127" w:name="ref-Simmonds2012"/>
     <w:p>
       <w:pPr>
         <w:pStyle w:val="Bibliography"/>
@@ -6100,7 +6114,7 @@
       <w:r>
         <w:t xml:space="preserve"> </w:t>
       </w:r>
-      <w:hyperlink r:id="rId125">
+      <w:hyperlink r:id="rId126">
         <w:r>
           <w:rPr>
             <w:rStyle w:val="Hyperlink"/>
@@ -6112,8 +6126,8 @@
         <w:t xml:space="preserve">.</w:t>
       </w:r>
     </w:p>
-    <w:bookmarkEnd w:id="126"/>
-    <w:bookmarkStart w:id="128" w:name="ref-Tamarin2017"/>
+    <w:bookmarkEnd w:id="127"/>
+    <w:bookmarkStart w:id="129" w:name="ref-Tamarin2017"/>
     <w:p>
       <w:pPr>
         <w:pStyle w:val="Bibliography"/>
@@ -6158,7 +6172,7 @@
       <w:r>
         <w:t xml:space="preserve"> </w:t>
       </w:r>
-      <w:hyperlink r:id="rId127">
+      <w:hyperlink r:id="rId128">
         <w:r>
           <w:rPr>
             <w:rStyle w:val="Hyperlink"/>
@@ -6170,8 +6184,8 @@
         <w:t xml:space="preserve">.</w:t>
       </w:r>
     </w:p>
-    <w:bookmarkEnd w:id="128"/>
-    <w:bookmarkStart w:id="130" w:name="ref-Thomas2019"/>
+    <w:bookmarkEnd w:id="129"/>
+    <w:bookmarkStart w:id="131" w:name="ref-Thomas2019"/>
     <w:p>
       <w:pPr>
         <w:pStyle w:val="Bibliography"/>
@@ -6288,7 +6302,7 @@
       <w:r>
         <w:t xml:space="preserve"> </w:t>
       </w:r>
-      <w:hyperlink r:id="rId129">
+      <w:hyperlink r:id="rId130">
         <w:r>
           <w:rPr>
             <w:rStyle w:val="Hyperlink"/>
@@ -6300,8 +6314,8 @@
         <w:t xml:space="preserve">.</w:t>
       </w:r>
     </w:p>
-    <w:bookmarkEnd w:id="130"/>
-    <w:bookmarkStart w:id="132" w:name="ref-Volodin2019"/>
+    <w:bookmarkEnd w:id="131"/>
+    <w:bookmarkStart w:id="133" w:name="ref-Volodin2019"/>
     <w:p>
       <w:pPr>
         <w:pStyle w:val="Bibliography"/>
@@ -6345,7 +6359,7 @@
       <w:r>
         <w:t xml:space="preserve"> </w:t>
       </w:r>
-      <w:hyperlink r:id="rId131">
+      <w:hyperlink r:id="rId132">
         <w:r>
           <w:rPr>
             <w:rStyle w:val="Hyperlink"/>
@@ -6357,8 +6371,8 @@
         <w:t xml:space="preserve">.</w:t>
       </w:r>
     </w:p>
-    <w:bookmarkEnd w:id="132"/>
-    <w:bookmarkStart w:id="134" w:name="ref-Volodin2019a"/>
+    <w:bookmarkEnd w:id="133"/>
+    <w:bookmarkStart w:id="135" w:name="ref-Volodin2019a"/>
     <w:p>
       <w:pPr>
         <w:pStyle w:val="Bibliography"/>
@@ -6408,7 +6422,7 @@
       <w:r>
         <w:t xml:space="preserve"> </w:t>
       </w:r>
-      <w:hyperlink r:id="rId133">
+      <w:hyperlink r:id="rId134">
         <w:r>
           <w:rPr>
             <w:rStyle w:val="Hyperlink"/>
@@ -6420,8 +6434,8 @@
         <w:t xml:space="preserve">.</w:t>
       </w:r>
     </w:p>
-    <w:bookmarkEnd w:id="134"/>
-    <w:bookmarkStart w:id="136" w:name="ref-Volodin2019c"/>
+    <w:bookmarkEnd w:id="135"/>
+    <w:bookmarkStart w:id="137" w:name="ref-Volodin2019c"/>
     <w:p>
       <w:pPr>
         <w:pStyle w:val="Bibliography"/>
@@ -6471,7 +6485,7 @@
       <w:r>
         <w:t xml:space="preserve"> </w:t>
       </w:r>
-      <w:hyperlink r:id="rId135">
+      <w:hyperlink r:id="rId136">
         <w:r>
           <w:rPr>
             <w:rStyle w:val="Hyperlink"/>
@@ -6483,8 +6497,8 @@
         <w:t xml:space="preserve">.</w:t>
       </w:r>
     </w:p>
-    <w:bookmarkEnd w:id="136"/>
-    <w:bookmarkStart w:id="138" w:name="ref-Volodin2019b"/>
+    <w:bookmarkEnd w:id="137"/>
+    <w:bookmarkStart w:id="139" w:name="ref-Volodin2019b"/>
     <w:p>
       <w:pPr>
         <w:pStyle w:val="Bibliography"/>
@@ -6534,7 +6548,7 @@
       <w:r>
         <w:t xml:space="preserve"> </w:t>
       </w:r>
-      <w:hyperlink r:id="rId137">
+      <w:hyperlink r:id="rId138">
         <w:r>
           <w:rPr>
             <w:rStyle w:val="Hyperlink"/>
@@ -6546,8 +6560,8 @@
         <w:t xml:space="preserve">.</w:t>
       </w:r>
     </w:p>
-    <w:bookmarkEnd w:id="138"/>
-    <w:bookmarkStart w:id="140" w:name="ref-ggplot2"/>
+    <w:bookmarkEnd w:id="139"/>
+    <w:bookmarkStart w:id="141" w:name="ref-ggplot2"/>
     <w:p>
       <w:pPr>
         <w:pStyle w:val="Bibliography"/>
@@ -6570,7 +6584,7 @@
       <w:r>
         <w:t xml:space="preserve"> </w:t>
       </w:r>
-      <w:hyperlink r:id="rId139">
+      <w:hyperlink r:id="rId140">
         <w:r>
           <w:rPr>
             <w:rStyle w:val="Hyperlink"/>
@@ -6582,8 +6596,8 @@
         <w:t xml:space="preserve">.</w:t>
       </w:r>
     </w:p>
-    <w:bookmarkEnd w:id="140"/>
-    <w:bookmarkStart w:id="142" w:name="ref-cowplot"/>
+    <w:bookmarkEnd w:id="141"/>
+    <w:bookmarkStart w:id="143" w:name="ref-cowplot"/>
     <w:p>
       <w:pPr>
         <w:pStyle w:val="Bibliography"/>
@@ -6600,7 +6614,7 @@
       <w:r>
         <w:t xml:space="preserve"> </w:t>
       </w:r>
-      <w:hyperlink r:id="rId141">
+      <w:hyperlink r:id="rId142">
         <w:r>
           <w:rPr>
             <w:rStyle w:val="Hyperlink"/>
@@ -6612,9 +6626,9 @@
         <w:t xml:space="preserve">.</w:t>
       </w:r>
     </w:p>
-    <w:bookmarkEnd w:id="142"/>
     <w:bookmarkEnd w:id="143"/>
     <w:bookmarkEnd w:id="144"/>
+    <w:bookmarkEnd w:id="145"/>
     <w:sectPr>
       <w:footnotePr>
         <w:numRestart w:val="eachSect"/>

</xml_diff>

<commit_message>
update zenodo link to doi version
</commit_message>
<xml_diff>
--- a/article/article.docx
+++ b/article/article.docx
@@ -39,7 +39,7 @@
         <w:pStyle w:val="Date"/>
       </w:pPr>
       <w:r>
-        <w:t xml:space="preserve">2026-04-28</w:t>
+        <w:t xml:space="preserve">2026-05-04</w:t>
       </w:r>
     </w:p>
     <w:p>
@@ -3790,7 +3790,7 @@
         <w:t xml:space="preserve">(Landis 2024)</w:t>
       </w:r>
       <w:r>
-        <w:t xml:space="preserve">, Quarto</w:t>
+        <w:t xml:space="preserve">, and Quarto</w:t>
       </w:r>
       <w:r>
         <w:t xml:space="preserve"> </w:t>
@@ -3855,7 +3855,7 @@
           <w:rPr>
             <w:rStyle w:val="Hyperlink"/>
           </w:rPr>
-          <w:t xml:space="preserve">https://zenodo.org/records/19840311</w:t>
+          <w:t xml:space="preserve">https://doi.org/10.5281/zenodo.19840311</w:t>
         </w:r>
       </w:hyperlink>
       <w:r>

</xml_diff>